<commit_message>
2d, full, threshold, run probability on test/full set
</commit_message>
<xml_diff>
--- a/Result/he reason Optuna isn.docx
+++ b/Result/he reason Optuna isn.docx
@@ -3,28 +3,12 @@
 <w:document xmlns:wpc="http://schemas.microsoft.com/office/word/2010/wordprocessingCanvas" xmlns:cx="http://schemas.microsoft.com/office/drawing/2014/chartex" xmlns:cx1="http://schemas.microsoft.com/office/drawing/2015/9/8/chartex" xmlns:cx2="http://schemas.microsoft.com/office/drawing/2015/10/21/chartex" xmlns:cx3="http://schemas.microsoft.com/office/drawing/2016/5/9/chartex" xmlns:cx4="http://schemas.microsoft.com/office/drawing/2016/5/10/chartex" xmlns:cx5="http://schemas.microsoft.com/office/drawing/2016/5/11/chartex" xmlns:cx6="http://schemas.microsoft.com/office/drawing/2016/5/12/chartex" xmlns:cx7="http://schemas.microsoft.com/office/drawing/2016/5/13/chartex" xmlns:cx8="http://schemas.microsoft.com/office/drawing/2016/5/14/chartex" xmlns:mc="http://schemas.openxmlformats.org/markup-compatibility/2006" xmlns:aink="http://schemas.microsoft.com/office/drawing/2016/ink" xmlns:am3d="http://schemas.microsoft.com/office/drawing/2017/model3d" xmlns:o="urn:schemas-microsoft-com:office:office" xmlns:oel="http://schemas.microsoft.com/office/2019/extlst" xmlns:r="http://schemas.openxmlformats.org/officeDocument/2006/relationships" xmlns:m="http://schemas.openxmlformats.org/officeDocument/2006/math" xmlns:v="urn:schemas-microsoft-com:vml" xmlns:wp14="http://schemas.microsoft.com/office/word/2010/wordprocessingDrawing" xmlns:wp="http://schemas.openxmlformats.org/drawingml/2006/wordprocessingDrawing" xmlns:w10="urn:schemas-microsoft-com:office:word" xmlns:w="http://schemas.openxmlformats.org/wordprocessingml/2006/main" xmlns:w14="http://schemas.microsoft.com/office/word/2010/wordml" xmlns:w15="http://schemas.microsoft.com/office/word/2012/wordml" xmlns:w16cex="http://schemas.microsoft.com/office/word/2018/wordml/cex" xmlns:w16cid="http://schemas.microsoft.com/office/word/2016/wordml/cid" xmlns:w16="http://schemas.microsoft.com/office/word/2018/wordml" xmlns:w16du="http://schemas.microsoft.com/office/word/2023/wordml/word16du" xmlns:w16sdtdh="http://schemas.microsoft.com/office/word/2020/wordml/sdtdatahash" xmlns:w16sdtfl="http://schemas.microsoft.com/office/word/2024/wordml/sdtformatlock" xmlns:w16se="http://schemas.microsoft.com/office/word/2015/wordml/symex" xmlns:wpg="http://schemas.microsoft.com/office/word/2010/wordprocessingGroup" xmlns:wpi="http://schemas.microsoft.com/office/word/2010/wordprocessingInk" xmlns:wne="http://schemas.microsoft.com/office/word/2006/wordml" xmlns:wps="http://schemas.microsoft.com/office/word/2010/wordprocessingShape" mc:Ignorable="w14 w15 w16se w16cid w16 w16cex w16sdtdh w16sdtfl w16du wp14">
   <w:body>
     <w:p>
-      <w:proofErr w:type="gramStart"/>
-      <w:r>
-        <w:t>he</w:t>
-      </w:r>
-      <w:proofErr w:type="gramEnd"/>
-      <w:r>
-        <w:t xml:space="preserve"> </w:t>
-      </w:r>
-      <w:proofErr w:type="gramStart"/>
-      <w:r>
-        <w:t>reason</w:t>
-      </w:r>
-      <w:proofErr w:type="gramEnd"/>
-      <w:r>
-        <w:t xml:space="preserve"> Optuna isn't beating your manual setup is due to a phenomenon called </w:t>
-      </w:r>
       <w:r>
         <w:rPr>
           <w:b/>
           <w:bCs/>
         </w:rPr>
-        <w:t>Dataset Proxy Variance</w:t>
+        <w:t>Variance</w:t>
       </w:r>
       <w:r>
         <w:t xml:space="preserve">. A model training on a small subset of 500 flights cannot generalize or learn the complex sensor boundaries present in a massive 9,212-flight dataset. Therefore, Optuna is optimizing parameters </w:t>
@@ -77,15 +61,7 @@
     </w:p>
     <w:p>
       <w:r>
-        <w:t xml:space="preserve">It works like an elimination tournament: it starts many different parameter configurations on the full </w:t>
-      </w:r>
-      <w:proofErr w:type="gramStart"/>
-      <w:r>
-        <w:t>dataset, but</w:t>
-      </w:r>
-      <w:proofErr w:type="gramEnd"/>
-      <w:r>
-        <w:t xml:space="preserve"> runs them for only </w:t>
+        <w:t xml:space="preserve">It works like an elimination tournament: it starts many different parameter configurations on the full dataset, but runs them for only </w:t>
       </w:r>
       <w:r>
         <w:rPr>
@@ -113,72 +89,30 @@
       </w:r>
     </w:p>
     <w:p>
-      <w:proofErr w:type="gramStart"/>
-      <w:r>
-        <w:t>import</w:t>
-      </w:r>
-      <w:proofErr w:type="gramEnd"/>
-      <w:r>
-        <w:t xml:space="preserve"> optuna</w:t>
-      </w:r>
-    </w:p>
-    <w:p>
-      <w:r>
-        <w:t xml:space="preserve">from </w:t>
-      </w:r>
-      <w:proofErr w:type="gramStart"/>
-      <w:r>
-        <w:t>optuna.samplers</w:t>
-      </w:r>
-      <w:proofErr w:type="gramEnd"/>
-      <w:r>
-        <w:t xml:space="preserve"> import TPESampler</w:t>
-      </w:r>
-    </w:p>
-    <w:p>
-      <w:r>
-        <w:t xml:space="preserve">from </w:t>
-      </w:r>
-      <w:proofErr w:type="gramStart"/>
-      <w:r>
-        <w:t>optuna.pruners</w:t>
-      </w:r>
-      <w:proofErr w:type="gramEnd"/>
-      <w:r>
-        <w:t xml:space="preserve"> import HyperbandPruner</w:t>
+      <w:r>
+        <w:t>import optuna</w:t>
+      </w:r>
+    </w:p>
+    <w:p>
+      <w:r>
+        <w:t>from optuna.samplers import TPESampler</w:t>
+      </w:r>
+    </w:p>
+    <w:p>
+      <w:r>
+        <w:t>from optuna.pruners import HyperbandPruner</w:t>
       </w:r>
     </w:p>
     <w:p/>
     <w:p>
       <w:r>
-        <w:t xml:space="preserve"># 1. </w:t>
-      </w:r>
-      <w:proofErr w:type="gramStart"/>
-      <w:r>
-        <w:t>Setup</w:t>
-      </w:r>
-      <w:proofErr w:type="gramEnd"/>
-      <w:r>
-        <w:t xml:space="preserve"> the study with a Pruner (Hyperband/ASHA)</w:t>
-      </w:r>
-    </w:p>
-    <w:p>
-      <w:r>
-        <w:t xml:space="preserve">study = </w:t>
-      </w:r>
-      <w:proofErr w:type="gramStart"/>
-      <w:r>
-        <w:t>optuna.create</w:t>
-      </w:r>
-      <w:proofErr w:type="gramEnd"/>
-      <w:r>
-        <w:t>_</w:t>
-      </w:r>
-      <w:proofErr w:type="gramStart"/>
-      <w:r>
-        <w:t>study(</w:t>
-      </w:r>
-      <w:proofErr w:type="gramEnd"/>
+        <w:t># 1. Setup the study with a Pruner (Hyperband/ASHA)</w:t>
+      </w:r>
+    </w:p>
+    <w:p>
+      <w:r>
+        <w:t>study = optuna.create_study(</w:t>
+      </w:r>
     </w:p>
     <w:p>
       <w:r>
@@ -187,28 +121,12 @@
     </w:p>
     <w:p>
       <w:r>
-        <w:t xml:space="preserve">    sampler=</w:t>
-      </w:r>
-      <w:proofErr w:type="gramStart"/>
-      <w:r>
-        <w:t>TPESampler(</w:t>
-      </w:r>
-      <w:proofErr w:type="gramEnd"/>
-      <w:r>
-        <w:t>),</w:t>
-      </w:r>
-    </w:p>
-    <w:p>
-      <w:r>
-        <w:t xml:space="preserve">    pruner=</w:t>
-      </w:r>
-      <w:proofErr w:type="gramStart"/>
-      <w:r>
-        <w:t>HyperbandPruner(</w:t>
-      </w:r>
-      <w:proofErr w:type="gramEnd"/>
-      <w:r>
-        <w:t>min_resource=1, max_resource=10, reduction_factor=3)</w:t>
+        <w:t xml:space="preserve">    sampler=TPESampler(),</w:t>
+      </w:r>
+    </w:p>
+    <w:p>
+      <w:r>
+        <w:t xml:space="preserve">    pruner=HyperbandPruner(min_resource=1, max_resource=10, reduction_factor=3)</w:t>
       </w:r>
     </w:p>
     <w:p>
@@ -219,12 +137,12 @@
     <w:p/>
     <w:p>
       <w:r>
+        <w:t># 2. Inside your Optuna objective function, report intermediate results after each epoch:</w:t>
+      </w:r>
+    </w:p>
+    <w:p>
+      <w:r>
         <w:lastRenderedPageBreak/>
-        <w:t># 2. Inside your Optuna objective function, report intermediate results after each epoch:</w:t>
-      </w:r>
-    </w:p>
-    <w:p>
-      <w:r>
         <w:t>def objective(trial):</w:t>
       </w:r>
     </w:p>
@@ -235,41 +153,17 @@
     </w:p>
     <w:p>
       <w:r>
-        <w:t xml:space="preserve">    for epoch in </w:t>
-      </w:r>
-      <w:proofErr w:type="gramStart"/>
-      <w:r>
-        <w:t>range(</w:t>
-      </w:r>
-      <w:proofErr w:type="gramEnd"/>
-      <w:r>
-        <w:t>10):</w:t>
-      </w:r>
-    </w:p>
-    <w:p>
-      <w:r>
-        <w:t xml:space="preserve">        # train_one_</w:t>
-      </w:r>
-      <w:proofErr w:type="gramStart"/>
-      <w:r>
-        <w:t>epoch(</w:t>
-      </w:r>
-      <w:proofErr w:type="gramEnd"/>
-      <w:r>
-        <w:t>)</w:t>
-      </w:r>
-    </w:p>
-    <w:p>
-      <w:r>
-        <w:t xml:space="preserve">        # val_pr_auc = </w:t>
-      </w:r>
-      <w:proofErr w:type="gramStart"/>
-      <w:r>
-        <w:t>evaluate(</w:t>
-      </w:r>
-      <w:proofErr w:type="gramEnd"/>
-      <w:r>
-        <w:t>)</w:t>
+        <w:t xml:space="preserve">    for epoch in range(10):</w:t>
+      </w:r>
+    </w:p>
+    <w:p>
+      <w:r>
+        <w:t xml:space="preserve">        # train_one_epoch()</w:t>
+      </w:r>
+    </w:p>
+    <w:p>
+      <w:r>
+        <w:t xml:space="preserve">        # val_pr_auc = evaluate()</w:t>
       </w:r>
     </w:p>
     <w:p>
@@ -279,34 +173,18 @@
     </w:p>
     <w:p>
       <w:r>
-        <w:t xml:space="preserve">        # Report </w:t>
-      </w:r>
-      <w:proofErr w:type="gramStart"/>
-      <w:r>
-        <w:t>score</w:t>
-      </w:r>
-      <w:proofErr w:type="gramEnd"/>
-      <w:r>
-        <w:t xml:space="preserve"> back to Optuna for monitoring</w:t>
+        <w:t xml:space="preserve">        # Report score back to Optuna for monitoring</w:t>
+      </w:r>
+    </w:p>
+    <w:p>
+      <w:r>
+        <w:t xml:space="preserve">        trial.report(val_pr_auc, step=epoch)</w:t>
       </w:r>
     </w:p>
     <w:p>
       <w:r>
         <w:t xml:space="preserve">        </w:t>
       </w:r>
-      <w:proofErr w:type="gramStart"/>
-      <w:r>
-        <w:t>trial.report</w:t>
-      </w:r>
-      <w:proofErr w:type="gramEnd"/>
-      <w:r>
-        <w:t>(val_pr_auc, step=epoch)</w:t>
-      </w:r>
-    </w:p>
-    <w:p>
-      <w:r>
-        <w:t xml:space="preserve">        </w:t>
-      </w:r>
     </w:p>
     <w:p>
       <w:r>
@@ -315,44 +193,12 @@
     </w:p>
     <w:p>
       <w:r>
-        <w:t xml:space="preserve">        if </w:t>
-      </w:r>
-      <w:proofErr w:type="gramStart"/>
-      <w:r>
-        <w:t>trial.should</w:t>
-      </w:r>
-      <w:proofErr w:type="gramEnd"/>
-      <w:r>
-        <w:t>_</w:t>
-      </w:r>
-      <w:proofErr w:type="gramStart"/>
-      <w:r>
-        <w:t>prune(</w:t>
-      </w:r>
-      <w:proofErr w:type="gramEnd"/>
-      <w:r>
-        <w:t>):</w:t>
-      </w:r>
-    </w:p>
-    <w:p>
-      <w:r>
-        <w:t xml:space="preserve">            raise </w:t>
-      </w:r>
-      <w:proofErr w:type="gramStart"/>
-      <w:r>
-        <w:t>optuna.exceptions</w:t>
-      </w:r>
-      <w:proofErr w:type="gramEnd"/>
-      <w:r>
-        <w:t>.</w:t>
-      </w:r>
-      <w:proofErr w:type="gramStart"/>
-      <w:r>
-        <w:t>TrialPruned(</w:t>
-      </w:r>
-      <w:proofErr w:type="gramEnd"/>
-      <w:r>
-        <w:t>)</w:t>
+        <w:t xml:space="preserve">        if trial.should_prune():</w:t>
+      </w:r>
+    </w:p>
+    <w:p>
+      <w:r>
+        <w:t xml:space="preserve">            raise optuna.exceptions.TrialPruned()</w:t>
       </w:r>
     </w:p>
     <w:p>
@@ -389,7 +235,7 @@
       <w:pPr>
         <w:numPr>
           <w:ilvl w:val="0"/>
-          <w:numId w:val="1"/>
+          <w:numId w:val="3"/>
         </w:numPr>
       </w:pPr>
       <w:r>
@@ -407,7 +253,7 @@
       <w:pPr>
         <w:numPr>
           <w:ilvl w:val="0"/>
-          <w:numId w:val="1"/>
+          <w:numId w:val="3"/>
         </w:numPr>
       </w:pPr>
       <w:r>
@@ -434,7 +280,7 @@
       <w:pPr>
         <w:numPr>
           <w:ilvl w:val="0"/>
-          <w:numId w:val="2"/>
+          <w:numId w:val="4"/>
         </w:numPr>
       </w:pPr>
       <w:r>
@@ -455,11 +301,10 @@
       <w:pPr>
         <w:numPr>
           <w:ilvl w:val="0"/>
-          <w:numId w:val="2"/>
+          <w:numId w:val="4"/>
         </w:numPr>
       </w:pPr>
       <w:r>
-        <w:lastRenderedPageBreak/>
         <w:t>Restrict your search space using what your manual runs already proved: lock dim_feedforward to 1024 and d_model to 256 (since smaller spaces failed in your manual tests).</w:t>
       </w:r>
     </w:p>
@@ -467,10 +312,11 @@
       <w:pPr>
         <w:numPr>
           <w:ilvl w:val="0"/>
-          <w:numId w:val="2"/>
+          <w:numId w:val="4"/>
         </w:numPr>
       </w:pPr>
       <w:r>
+        <w:lastRenderedPageBreak/>
         <w:t xml:space="preserve">Run Optuna for only </w:t>
       </w:r>
       <w:r>
@@ -525,15 +371,7 @@
     </w:p>
     <w:p>
       <w:r>
-        <w:t xml:space="preserve">study = </w:t>
-      </w:r>
-      <w:proofErr w:type="gramStart"/>
-      <w:r>
-        <w:t>optuna.create</w:t>
-      </w:r>
-      <w:proofErr w:type="gramEnd"/>
-      <w:r>
-        <w:t>_study(direction="maximize")</w:t>
+        <w:t>study = optuna.create_study(direction="maximize")</w:t>
       </w:r>
     </w:p>
     <w:p/>
@@ -559,28 +397,12 @@
     </w:p>
     <w:p>
       <w:r>
-        <w:t xml:space="preserve">    "</w:t>
-      </w:r>
-      <w:proofErr w:type="gramStart"/>
-      <w:r>
-        <w:t>num</w:t>
-      </w:r>
-      <w:proofErr w:type="gramEnd"/>
-      <w:r>
-        <w:t>_layers": 4,</w:t>
-      </w:r>
-    </w:p>
-    <w:p>
-      <w:r>
-        <w:t xml:space="preserve">    "</w:t>
-      </w:r>
-      <w:proofErr w:type="gramStart"/>
-      <w:r>
-        <w:t>dim</w:t>
-      </w:r>
-      <w:proofErr w:type="gramEnd"/>
-      <w:r>
-        <w:t>_ff": 1024,</w:t>
+        <w:t xml:space="preserve">    "num_layers": 4,</w:t>
+      </w:r>
+    </w:p>
+    <w:p>
+      <w:r>
+        <w:t xml:space="preserve">    "dim_ff": 1024,</w:t>
       </w:r>
     </w:p>
     <w:p>
@@ -600,13 +422,8 @@
     </w:p>
     <w:p/>
     <w:p>
-      <w:proofErr w:type="gramStart"/>
-      <w:r>
-        <w:t>study.enqueue</w:t>
-      </w:r>
-      <w:proofErr w:type="gramEnd"/>
-      <w:r>
-        <w:t>_trial(best_manual_params)</w:t>
+      <w:r>
+        <w:t>study.enqueue_trial(best_manual_params)</w:t>
       </w:r>
     </w:p>
     <w:p/>
@@ -617,18 +434,12 @@
     </w:p>
     <w:p>
       <w:r>
-        <w:lastRenderedPageBreak/>
         <w:t># and TPE Sampler will build its next search relative to these high-performing bounds.</w:t>
       </w:r>
     </w:p>
     <w:p>
-      <w:proofErr w:type="gramStart"/>
-      <w:r>
-        <w:t>study.optimize</w:t>
-      </w:r>
-      <w:proofErr w:type="gramEnd"/>
-      <w:r>
-        <w:t>(objective, n_trials=15)</w:t>
+      <w:r>
+        <w:t>study.optimize(objective, n_trials=15)</w:t>
       </w:r>
     </w:p>
     <w:p>
@@ -643,6 +454,7 @@
           <w:b/>
           <w:bCs/>
         </w:rPr>
+        <w:lastRenderedPageBreak/>
         <w:t>Summary Recommendation:</w:t>
       </w:r>
     </w:p>
@@ -705,6 +517,119 @@
 <file path=word/numbering.xml><?xml version="1.0" encoding="utf-8"?>
 <w:numbering xmlns:wpc="http://schemas.microsoft.com/office/word/2010/wordprocessingCanvas" xmlns:cx="http://schemas.microsoft.com/office/drawing/2014/chartex" xmlns:cx1="http://schemas.microsoft.com/office/drawing/2015/9/8/chartex" xmlns:cx2="http://schemas.microsoft.com/office/drawing/2015/10/21/chartex" xmlns:cx3="http://schemas.microsoft.com/office/drawing/2016/5/9/chartex" xmlns:cx4="http://schemas.microsoft.com/office/drawing/2016/5/10/chartex" xmlns:cx5="http://schemas.microsoft.com/office/drawing/2016/5/11/chartex" xmlns:cx6="http://schemas.microsoft.com/office/drawing/2016/5/12/chartex" xmlns:cx7="http://schemas.microsoft.com/office/drawing/2016/5/13/chartex" xmlns:cx8="http://schemas.microsoft.com/office/drawing/2016/5/14/chartex" xmlns:mc="http://schemas.openxmlformats.org/markup-compatibility/2006" xmlns:aink="http://schemas.microsoft.com/office/drawing/2016/ink" xmlns:am3d="http://schemas.microsoft.com/office/drawing/2017/model3d" xmlns:o="urn:schemas-microsoft-com:office:office" xmlns:oel="http://schemas.microsoft.com/office/2019/extlst" xmlns:r="http://schemas.openxmlformats.org/officeDocument/2006/relationships" xmlns:m="http://schemas.openxmlformats.org/officeDocument/2006/math" xmlns:v="urn:schemas-microsoft-com:vml" xmlns:wp14="http://schemas.microsoft.com/office/word/2010/wordprocessingDrawing" xmlns:wp="http://schemas.openxmlformats.org/drawingml/2006/wordprocessingDrawing" xmlns:w10="urn:schemas-microsoft-com:office:word" xmlns:w="http://schemas.openxmlformats.org/wordprocessingml/2006/main" xmlns:w14="http://schemas.microsoft.com/office/word/2010/wordml" xmlns:w15="http://schemas.microsoft.com/office/word/2012/wordml" xmlns:w16cex="http://schemas.microsoft.com/office/word/2018/wordml/cex" xmlns:w16cid="http://schemas.microsoft.com/office/word/2016/wordml/cid" xmlns:w16="http://schemas.microsoft.com/office/word/2018/wordml" xmlns:w16du="http://schemas.microsoft.com/office/word/2023/wordml/word16du" xmlns:w16sdtdh="http://schemas.microsoft.com/office/word/2020/wordml/sdtdatahash" xmlns:w16sdtfl="http://schemas.microsoft.com/office/word/2024/wordml/sdtformatlock" xmlns:w16se="http://schemas.microsoft.com/office/word/2015/wordml/symex" xmlns:wpg="http://schemas.microsoft.com/office/word/2010/wordprocessingGroup" xmlns:wpi="http://schemas.microsoft.com/office/word/2010/wordprocessingInk" xmlns:wne="http://schemas.microsoft.com/office/word/2006/wordml" xmlns:wps="http://schemas.microsoft.com/office/word/2010/wordprocessingShape" mc:Ignorable="w14 w15 w16se w16cid w16 w16cex w16sdtdh w16sdtfl w16du wp14">
   <w:abstractNum w:abstractNumId="0" w15:restartNumberingAfterBreak="0">
+    <w:nsid w:val="12A205D0"/>
+    <w:multiLevelType w:val="multilevel"/>
+    <w:tmpl w:val="65722BCA"/>
+    <w:lvl w:ilvl="0">
+      <w:start w:val="1"/>
+      <w:numFmt w:val="decimal"/>
+      <w:lvlText w:val="%1."/>
+      <w:lvlJc w:val="left"/>
+      <w:pPr>
+        <w:tabs>
+          <w:tab w:val="num" w:pos="720"/>
+        </w:tabs>
+        <w:ind w:left="720" w:hanging="360"/>
+      </w:pPr>
+    </w:lvl>
+    <w:lvl w:ilvl="1" w:tentative="1">
+      <w:start w:val="1"/>
+      <w:numFmt w:val="decimal"/>
+      <w:lvlText w:val="%2."/>
+      <w:lvlJc w:val="left"/>
+      <w:pPr>
+        <w:tabs>
+          <w:tab w:val="num" w:pos="1440"/>
+        </w:tabs>
+        <w:ind w:left="1440" w:hanging="360"/>
+      </w:pPr>
+    </w:lvl>
+    <w:lvl w:ilvl="2" w:tentative="1">
+      <w:start w:val="1"/>
+      <w:numFmt w:val="decimal"/>
+      <w:lvlText w:val="%3."/>
+      <w:lvlJc w:val="left"/>
+      <w:pPr>
+        <w:tabs>
+          <w:tab w:val="num" w:pos="2160"/>
+        </w:tabs>
+        <w:ind w:left="2160" w:hanging="360"/>
+      </w:pPr>
+    </w:lvl>
+    <w:lvl w:ilvl="3" w:tentative="1">
+      <w:start w:val="1"/>
+      <w:numFmt w:val="decimal"/>
+      <w:lvlText w:val="%4."/>
+      <w:lvlJc w:val="left"/>
+      <w:pPr>
+        <w:tabs>
+          <w:tab w:val="num" w:pos="2880"/>
+        </w:tabs>
+        <w:ind w:left="2880" w:hanging="360"/>
+      </w:pPr>
+    </w:lvl>
+    <w:lvl w:ilvl="4" w:tentative="1">
+      <w:start w:val="1"/>
+      <w:numFmt w:val="decimal"/>
+      <w:lvlText w:val="%5."/>
+      <w:lvlJc w:val="left"/>
+      <w:pPr>
+        <w:tabs>
+          <w:tab w:val="num" w:pos="3600"/>
+        </w:tabs>
+        <w:ind w:left="3600" w:hanging="360"/>
+      </w:pPr>
+    </w:lvl>
+    <w:lvl w:ilvl="5" w:tentative="1">
+      <w:start w:val="1"/>
+      <w:numFmt w:val="decimal"/>
+      <w:lvlText w:val="%6."/>
+      <w:lvlJc w:val="left"/>
+      <w:pPr>
+        <w:tabs>
+          <w:tab w:val="num" w:pos="4320"/>
+        </w:tabs>
+        <w:ind w:left="4320" w:hanging="360"/>
+      </w:pPr>
+    </w:lvl>
+    <w:lvl w:ilvl="6" w:tentative="1">
+      <w:start w:val="1"/>
+      <w:numFmt w:val="decimal"/>
+      <w:lvlText w:val="%7."/>
+      <w:lvlJc w:val="left"/>
+      <w:pPr>
+        <w:tabs>
+          <w:tab w:val="num" w:pos="5040"/>
+        </w:tabs>
+        <w:ind w:left="5040" w:hanging="360"/>
+      </w:pPr>
+    </w:lvl>
+    <w:lvl w:ilvl="7" w:tentative="1">
+      <w:start w:val="1"/>
+      <w:numFmt w:val="decimal"/>
+      <w:lvlText w:val="%8."/>
+      <w:lvlJc w:val="left"/>
+      <w:pPr>
+        <w:tabs>
+          <w:tab w:val="num" w:pos="5760"/>
+        </w:tabs>
+        <w:ind w:left="5760" w:hanging="360"/>
+      </w:pPr>
+    </w:lvl>
+    <w:lvl w:ilvl="8" w:tentative="1">
+      <w:start w:val="1"/>
+      <w:numFmt w:val="decimal"/>
+      <w:lvlText w:val="%9."/>
+      <w:lvlJc w:val="left"/>
+      <w:pPr>
+        <w:tabs>
+          <w:tab w:val="num" w:pos="6480"/>
+        </w:tabs>
+        <w:ind w:left="6480" w:hanging="360"/>
+      </w:pPr>
+    </w:lvl>
+  </w:abstractNum>
+  <w:abstractNum w:abstractNumId="1" w15:restartNumberingAfterBreak="0">
     <w:nsid w:val="26D02F13"/>
     <w:multiLevelType w:val="multilevel"/>
     <w:tmpl w:val="2E049898"/>
@@ -817,7 +742,7 @@
       </w:pPr>
     </w:lvl>
   </w:abstractNum>
-  <w:abstractNum w:abstractNumId="1" w15:restartNumberingAfterBreak="0">
+  <w:abstractNum w:abstractNumId="2" w15:restartNumberingAfterBreak="0">
     <w:nsid w:val="28382E30"/>
     <w:multiLevelType w:val="multilevel"/>
     <w:tmpl w:val="53A69272"/>
@@ -966,10 +891,165 @@
       </w:rPr>
     </w:lvl>
   </w:abstractNum>
+  <w:abstractNum w:abstractNumId="3" w15:restartNumberingAfterBreak="0">
+    <w:nsid w:val="364833BA"/>
+    <w:multiLevelType w:val="multilevel"/>
+    <w:tmpl w:val="3BC2D4A0"/>
+    <w:lvl w:ilvl="0">
+      <w:start w:val="1"/>
+      <w:numFmt w:val="bullet"/>
+      <w:lvlText w:val=""/>
+      <w:lvlJc w:val="left"/>
+      <w:pPr>
+        <w:tabs>
+          <w:tab w:val="num" w:pos="720"/>
+        </w:tabs>
+        <w:ind w:left="720" w:hanging="360"/>
+      </w:pPr>
+      <w:rPr>
+        <w:rFonts w:ascii="Symbol" w:hAnsi="Symbol" w:hint="default"/>
+        <w:sz w:val="20"/>
+      </w:rPr>
+    </w:lvl>
+    <w:lvl w:ilvl="1" w:tentative="1">
+      <w:start w:val="1"/>
+      <w:numFmt w:val="bullet"/>
+      <w:lvlText w:val="o"/>
+      <w:lvlJc w:val="left"/>
+      <w:pPr>
+        <w:tabs>
+          <w:tab w:val="num" w:pos="1440"/>
+        </w:tabs>
+        <w:ind w:left="1440" w:hanging="360"/>
+      </w:pPr>
+      <w:rPr>
+        <w:rFonts w:ascii="Courier New" w:hAnsi="Courier New" w:hint="default"/>
+        <w:sz w:val="20"/>
+      </w:rPr>
+    </w:lvl>
+    <w:lvl w:ilvl="2" w:tentative="1">
+      <w:start w:val="1"/>
+      <w:numFmt w:val="bullet"/>
+      <w:lvlText w:val=""/>
+      <w:lvlJc w:val="left"/>
+      <w:pPr>
+        <w:tabs>
+          <w:tab w:val="num" w:pos="2160"/>
+        </w:tabs>
+        <w:ind w:left="2160" w:hanging="360"/>
+      </w:pPr>
+      <w:rPr>
+        <w:rFonts w:ascii="Wingdings" w:hAnsi="Wingdings" w:hint="default"/>
+        <w:sz w:val="20"/>
+      </w:rPr>
+    </w:lvl>
+    <w:lvl w:ilvl="3" w:tentative="1">
+      <w:start w:val="1"/>
+      <w:numFmt w:val="bullet"/>
+      <w:lvlText w:val=""/>
+      <w:lvlJc w:val="left"/>
+      <w:pPr>
+        <w:tabs>
+          <w:tab w:val="num" w:pos="2880"/>
+        </w:tabs>
+        <w:ind w:left="2880" w:hanging="360"/>
+      </w:pPr>
+      <w:rPr>
+        <w:rFonts w:ascii="Wingdings" w:hAnsi="Wingdings" w:hint="default"/>
+        <w:sz w:val="20"/>
+      </w:rPr>
+    </w:lvl>
+    <w:lvl w:ilvl="4" w:tentative="1">
+      <w:start w:val="1"/>
+      <w:numFmt w:val="bullet"/>
+      <w:lvlText w:val=""/>
+      <w:lvlJc w:val="left"/>
+      <w:pPr>
+        <w:tabs>
+          <w:tab w:val="num" w:pos="3600"/>
+        </w:tabs>
+        <w:ind w:left="3600" w:hanging="360"/>
+      </w:pPr>
+      <w:rPr>
+        <w:rFonts w:ascii="Wingdings" w:hAnsi="Wingdings" w:hint="default"/>
+        <w:sz w:val="20"/>
+      </w:rPr>
+    </w:lvl>
+    <w:lvl w:ilvl="5" w:tentative="1">
+      <w:start w:val="1"/>
+      <w:numFmt w:val="bullet"/>
+      <w:lvlText w:val=""/>
+      <w:lvlJc w:val="left"/>
+      <w:pPr>
+        <w:tabs>
+          <w:tab w:val="num" w:pos="4320"/>
+        </w:tabs>
+        <w:ind w:left="4320" w:hanging="360"/>
+      </w:pPr>
+      <w:rPr>
+        <w:rFonts w:ascii="Wingdings" w:hAnsi="Wingdings" w:hint="default"/>
+        <w:sz w:val="20"/>
+      </w:rPr>
+    </w:lvl>
+    <w:lvl w:ilvl="6" w:tentative="1">
+      <w:start w:val="1"/>
+      <w:numFmt w:val="bullet"/>
+      <w:lvlText w:val=""/>
+      <w:lvlJc w:val="left"/>
+      <w:pPr>
+        <w:tabs>
+          <w:tab w:val="num" w:pos="5040"/>
+        </w:tabs>
+        <w:ind w:left="5040" w:hanging="360"/>
+      </w:pPr>
+      <w:rPr>
+        <w:rFonts w:ascii="Wingdings" w:hAnsi="Wingdings" w:hint="default"/>
+        <w:sz w:val="20"/>
+      </w:rPr>
+    </w:lvl>
+    <w:lvl w:ilvl="7" w:tentative="1">
+      <w:start w:val="1"/>
+      <w:numFmt w:val="bullet"/>
+      <w:lvlText w:val=""/>
+      <w:lvlJc w:val="left"/>
+      <w:pPr>
+        <w:tabs>
+          <w:tab w:val="num" w:pos="5760"/>
+        </w:tabs>
+        <w:ind w:left="5760" w:hanging="360"/>
+      </w:pPr>
+      <w:rPr>
+        <w:rFonts w:ascii="Wingdings" w:hAnsi="Wingdings" w:hint="default"/>
+        <w:sz w:val="20"/>
+      </w:rPr>
+    </w:lvl>
+    <w:lvl w:ilvl="8" w:tentative="1">
+      <w:start w:val="1"/>
+      <w:numFmt w:val="bullet"/>
+      <w:lvlText w:val=""/>
+      <w:lvlJc w:val="left"/>
+      <w:pPr>
+        <w:tabs>
+          <w:tab w:val="num" w:pos="6480"/>
+        </w:tabs>
+        <w:ind w:left="6480" w:hanging="360"/>
+      </w:pPr>
+      <w:rPr>
+        <w:rFonts w:ascii="Wingdings" w:hAnsi="Wingdings" w:hint="default"/>
+        <w:sz w:val="20"/>
+      </w:rPr>
+    </w:lvl>
+  </w:abstractNum>
   <w:num w:numId="1" w16cid:durableId="1474787900">
+    <w:abstractNumId w:val="2"/>
+  </w:num>
+  <w:num w:numId="2" w16cid:durableId="1231578656">
     <w:abstractNumId w:val="1"/>
   </w:num>
-  <w:num w:numId="2" w16cid:durableId="1231578656">
+  <w:num w:numId="3" w16cid:durableId="991063220">
+    <w:abstractNumId w:val="3"/>
+  </w:num>
+  <w:num w:numId="4" w16cid:durableId="554783525">
     <w:abstractNumId w:val="0"/>
   </w:num>
 </w:numbering>
@@ -2207,4 +2287,10 @@
     </a:ext>
   </a:extLst>
 </a:theme>
+</file>
+
+<file path=docMetadata/LabelInfo.xml><?xml version="1.0" encoding="utf-8"?>
+<clbl:labelList xmlns:clbl="http://schemas.microsoft.com/office/2020/mipLabelMetadata">
+  <clbl:label id="{c98a79ca-5a9a-4791-a243-f06afd67464d}" enabled="0" method="" siteId="{c98a79ca-5a9a-4791-a243-f06afd67464d}" removed="1"/>
+</clbl:labelList>
 </file>
</xml_diff>